<commit_message>
fix(web): mobile S24 layout + portfolio URL mi-portafolio
Snap carousel for course cards on narrow viewports, hamburger touch
targets, hero overflow/type fixes, Pages URL rename, and matching
unit/e2e coverage.

Co-authored-by: Harp-Andres <Harp-Andres@users.noreply.github.com>
</commit_message>
<xml_diff>
--- a/Hoja De Vida/HV_2026_2_ATS_AndresRodriguez.docx
+++ b/Hoja De Vida/HV_2026_2_ATS_AndresRodriguez.docx
@@ -69,7 +69,7 @@
           <w:color w:val="2E75B6"/>
           <w:sz w:val="18"/>
         </w:rPr>
-        <w:t>Portafolio: https://Harp-Andres.github.io/MiPortafolio</w:t>
+        <w:t>Portafolio: https://harp-andres.github.io/mi-portafolio/</w:t>
       </w:r>
     </w:p>
     <w:p>
@@ -86,7 +86,7 @@
           <w:color w:val="1F4E79"/>
           <w:sz w:val="24"/>
         </w:rPr>
-        <w:t>PEROFESIONAL</w:t>
+        <w:t>PERFIL PROFESIONAL</w:t>
       </w:r>
     </w:p>
     <w:p>
@@ -1383,7 +1383,7 @@
           <w:color w:val="2E75B6"/>
           <w:sz w:val="20"/>
         </w:rPr>
-        <w:t>https://Harp-Andres.github.io/MiPortafolio</w:t>
+        <w:t>https://harp-andres.github.io/mi-portafolio/</w:t>
       </w:r>
     </w:p>
     <w:p>

</xml_diff>

<commit_message>
feat(cv): add Docker SysAdmin/DevOps Udemy certificate
- Add 'Maneja Docker en 5 dias: SysAdmin Linux o DevOps' (Udemy, 7h) to DevOps & Cloud

- Move certificado-docker.jpg from dist into public so it ships to GitHub Pages

- Sync web, core and PDF generator data; regenerate ATS/Visual PDF and DOCX

Co-authored-by: Cursor <cursoragent@cursor.com>
</commit_message>
<xml_diff>
--- a/Hoja De Vida/HV_2026_2_ATS_AndresRodriguez.docx
+++ b/Hoja De Vida/HV_2026_2_ATS_AndresRodriguez.docx
@@ -1036,6 +1036,20 @@
           <w:color w:val="1A1A1A"/>
           <w:sz w:val="20"/>
         </w:rPr>
+        <w:t>Maneja Docker en 5 días: SysAdmin Linux o DevOps — Udemy (7h)</w:t>
+      </w:r>
+    </w:p>
+    <w:p>
+      <w:pPr>
+        <w:pStyle w:val="ListBullet"/>
+      </w:pPr>
+      <w:r>
+        <w:rPr>
+          <w:b w:val="0"/>
+          <w:i w:val="0"/>
+          <w:color w:val="1A1A1A"/>
+          <w:sz w:val="20"/>
+        </w:rPr>
         <w:t>Docker Compose with Selenium — Udemy (3h)</w:t>
       </w:r>
     </w:p>

</xml_diff>